<commit_message>
Update project report with authentication module documentation
</commit_message>
<xml_diff>
--- a/docs/project-report.docx
+++ b/docs/project-report.docx
@@ -1218,10 +1218,178 @@
       </w:pPr>
       <w:r>
         <w:rPr>
+          <w:b/>
+          <w:bCs/>
+        </w:rPr>
+        <w:t xml:space="preserve">User &amp; Authentication Module (Completed):</w:t>
+      </w:r>
+    </w:p>
+    <w:p>
+      <w:pPr>
+        <w:pStyle w:val="ListParagraph"/>
+        <w:numPr>
+          <w:ilvl w:val="0"/>
+          <w:numId w:val="1"/>
+        </w:numPr>
+        <w:spacing w:after="80"/>
+      </w:pPr>
+      <w:r>
+        <w:t xml:space="preserve">Designed the User schema with fields: name, email (unique), password, and role (restricted to "user" or "admin" via an enum, defaulting to "user").</w:t>
+      </w:r>
+    </w:p>
+    <w:p>
+      <w:pPr>
+        <w:pStyle w:val="ListParagraph"/>
+        <w:numPr>
+          <w:ilvl w:val="0"/>
+          <w:numId w:val="1"/>
+        </w:numPr>
+        <w:spacing w:after="80"/>
+      </w:pPr>
+      <w:r>
+        <w:t xml:space="preserve">Implemented password security using bcrypt.js: passwords are salted and hashed before being stored, and never saved or returned in plain text.</w:t>
+      </w:r>
+    </w:p>
+    <w:p>
+      <w:pPr>
+        <w:pStyle w:val="ListParagraph"/>
+        <w:numPr>
+          <w:ilvl w:val="0"/>
+          <w:numId w:val="1"/>
+        </w:numPr>
+        <w:spacing w:after="80"/>
+      </w:pPr>
+      <w:r>
+        <w:t xml:space="preserve">Built authController.js with registerUser and loginUser functions. Registration checks for duplicate emails before creating an account; login verifies credentials using bcrypt comparison.</w:t>
+      </w:r>
+    </w:p>
+    <w:p>
+      <w:pPr>
+        <w:pStyle w:val="ListParagraph"/>
+        <w:numPr>
+          <w:ilvl w:val="0"/>
+          <w:numId w:val="1"/>
+        </w:numPr>
+        <w:spacing w:after="80"/>
+      </w:pPr>
+      <w:r>
+        <w:t xml:space="preserve">Implemented JWT-based authentication: on successful registration or login, a signed token (containing the user’s ID and role, valid for 7 days) is issued to the client.</w:t>
+      </w:r>
+    </w:p>
+    <w:p>
+      <w:pPr>
+        <w:pStyle w:val="ListParagraph"/>
+        <w:numPr>
+          <w:ilvl w:val="0"/>
+          <w:numId w:val="1"/>
+        </w:numPr>
+        <w:spacing w:after="80"/>
+      </w:pPr>
+      <w:r>
+        <w:t xml:space="preserve">Created authRoutes.js exposing POST /api/auth/register and POST /api/auth/login.</w:t>
+      </w:r>
+    </w:p>
+    <w:p>
+      <w:pPr>
+        <w:pStyle w:val="ListParagraph"/>
+        <w:numPr>
+          <w:ilvl w:val="0"/>
+          <w:numId w:val="1"/>
+        </w:numPr>
+        <w:spacing w:after="80"/>
+      </w:pPr>
+      <w:r>
+        <w:t xml:space="preserve">Built authMiddleware.js with two middleware functions: protect (verifies a valid JWT is present) and adminOnly (verifies the authenticated user’s role is "admin").</w:t>
+      </w:r>
+    </w:p>
+    <w:p>
+      <w:pPr>
+        <w:pStyle w:val="ListParagraph"/>
+        <w:numPr>
+          <w:ilvl w:val="0"/>
+          <w:numId w:val="1"/>
+        </w:numPr>
+        <w:spacing w:after="80"/>
+      </w:pPr>
+      <w:r>
+        <w:t xml:space="preserve">Applied this middleware to the event creation route, so only authenticated admin users can create events, while event listing/viewing remains public.</w:t>
+      </w:r>
+    </w:p>
+    <w:p>
+      <w:pPr>
+        <w:pStyle w:val="ListParagraph"/>
+        <w:numPr>
+          <w:ilvl w:val="0"/>
+          <w:numId w:val="1"/>
+        </w:numPr>
+        <w:spacing w:after="80"/>
+      </w:pPr>
+      <w:r>
+        <w:t xml:space="preserve">Verified the complete authentication and authorization flow using Thunder Client:</w:t>
+      </w:r>
+    </w:p>
+    <w:p>
+      <w:pPr>
+        <w:pStyle w:val="ListParagraph"/>
+        <w:numPr>
+          <w:ilvl w:val="1"/>
+          <w:numId w:val="1"/>
+        </w:numPr>
+        <w:spacing w:after="80"/>
+      </w:pPr>
+      <w:r>
+        <w:t xml:space="preserve">Registration returned 201 Created with a valid token, and login returned 200 OK for correct credentials and 401 Unauthorized for an incorrect password.</w:t>
+      </w:r>
+    </w:p>
+    <w:p>
+      <w:pPr>
+        <w:pStyle w:val="ListParagraph"/>
+        <w:numPr>
+          <w:ilvl w:val="1"/>
+          <w:numId w:val="1"/>
+        </w:numPr>
+        <w:spacing w:after="80"/>
+      </w:pPr>
+      <w:r>
+        <w:t xml:space="preserve">Attempting to create an event without a token returned 401 Not authorized, no token provided.</w:t>
+      </w:r>
+    </w:p>
+    <w:p>
+      <w:pPr>
+        <w:pStyle w:val="ListParagraph"/>
+        <w:numPr>
+          <w:ilvl w:val="1"/>
+          <w:numId w:val="1"/>
+        </w:numPr>
+        <w:spacing w:after="80"/>
+      </w:pPr>
+      <w:r>
+        <w:t xml:space="preserve">Attempting to create an event with a valid token but a "user" role returned 403 Access denied, admin only.</w:t>
+      </w:r>
+    </w:p>
+    <w:p>
+      <w:pPr>
+        <w:pStyle w:val="ListParagraph"/>
+        <w:numPr>
+          <w:ilvl w:val="1"/>
+          <w:numId w:val="1"/>
+        </w:numPr>
+        <w:spacing w:after="80"/>
+      </w:pPr>
+      <w:r>
+        <w:t xml:space="preserve">After manually promoting the account to "admin" in the database and generating a fresh token, the same request succeeded with 201 Created, confirming the full authorization chain works correctly end-to-end.</w:t>
+      </w:r>
+    </w:p>
+    <w:p>
+      <w:pPr>
+        <w:spacing w:after="150"/>
+      </w:pPr>
+      <w:r>
+        <w:rPr>
           <w:i/>
           <w:iCs/>
         </w:rPr>
-        <w:t xml:space="preserve">(Sections for the User/Authentication module, frontend development, testing, and conclusion will be added as development progresses.)</w:t>
+        <w:t xml:space="preserve">This completes the core backend (Phase 2). Sections for frontend development, testing, and the conclusion will be added as development progresses.</w:t>
       </w:r>
     </w:p>
     <w:p>

</xml_diff>

<commit_message>
Update project report with frontend and registration module documentation
</commit_message>
<xml_diff>
--- a/docs/project-report.docx
+++ b/docs/project-report.docx
@@ -1389,7 +1389,245 @@
           <w:i/>
           <w:iCs/>
         </w:rPr>
-        <w:t xml:space="preserve">This completes the core backend (Phase 2). Sections for frontend development, testing, and the conclusion will be added as development progresses.</w:t>
+        <w:t xml:space="preserve">This completes the core backend (Phase 2).</w:t>
+      </w:r>
+    </w:p>
+    <w:p>
+      <w:pPr>
+        <w:pStyle w:val="Heading2"/>
+        <w:spacing w:after="120" w:before="250"/>
+      </w:pPr>
+      <w:r>
+        <w:t xml:space="preserve">Phase 3 — Frontend Development (In Progress)</w:t>
+      </w:r>
+    </w:p>
+    <w:p>
+      <w:pPr>
+        <w:spacing w:after="150"/>
+      </w:pPr>
+      <w:r>
+        <w:rPr>
+          <w:b/>
+          <w:bCs/>
+        </w:rPr>
+        <w:t xml:space="preserve">Project Setup:</w:t>
+      </w:r>
+    </w:p>
+    <w:p>
+      <w:pPr>
+        <w:pStyle w:val="ListParagraph"/>
+        <w:numPr>
+          <w:ilvl w:val="0"/>
+          <w:numId w:val="1"/>
+        </w:numPr>
+        <w:spacing w:after="80"/>
+      </w:pPr>
+      <w:r>
+        <w:t xml:space="preserve">Initialized the frontend using React (via Vite) in a dedicated frontend/ folder, separate from the backend.</w:t>
+      </w:r>
+    </w:p>
+    <w:p>
+      <w:pPr>
+        <w:pStyle w:val="ListParagraph"/>
+        <w:numPr>
+          <w:ilvl w:val="0"/>
+          <w:numId w:val="1"/>
+        </w:numPr>
+        <w:spacing w:after="80"/>
+      </w:pPr>
+      <w:r>
+        <w:t xml:space="preserve">Installed axios for API communication and react-router-dom for client-side page navigation.</w:t>
+      </w:r>
+    </w:p>
+    <w:p>
+      <w:pPr>
+        <w:pStyle w:val="ListParagraph"/>
+        <w:numPr>
+          <w:ilvl w:val="0"/>
+          <w:numId w:val="1"/>
+        </w:numPr>
+        <w:spacing w:after="80"/>
+      </w:pPr>
+      <w:r>
+        <w:t xml:space="preserve">Created a centralized Axios instance (api/axios.js) with a base URL pointing to the backend, avoiding repetition across components.</w:t>
+      </w:r>
+    </w:p>
+    <w:p>
+      <w:pPr>
+        <w:spacing w:after="150"/>
+      </w:pPr>
+      <w:r>
+        <w:rPr>
+          <w:b/>
+          <w:bCs/>
+        </w:rPr>
+        <w:t xml:space="preserve">Registration Module (Backend addition):</w:t>
+      </w:r>
+    </w:p>
+    <w:p>
+      <w:pPr>
+        <w:pStyle w:val="ListParagraph"/>
+        <w:numPr>
+          <w:ilvl w:val="0"/>
+          <w:numId w:val="1"/>
+        </w:numPr>
+        <w:spacing w:after="80"/>
+      </w:pPr>
+      <w:r>
+        <w:t xml:space="preserve">Designed a Registration schema linking a registrant (name, email) to a specific event via a MongoDB ObjectId reference.</w:t>
+      </w:r>
+    </w:p>
+    <w:p>
+      <w:pPr>
+        <w:pStyle w:val="ListParagraph"/>
+        <w:numPr>
+          <w:ilvl w:val="0"/>
+          <w:numId w:val="1"/>
+        </w:numPr>
+        <w:spacing w:after="80"/>
+      </w:pPr>
+      <w:r>
+        <w:t xml:space="preserve">Built registerForEvent, which checks the event’s current registration count against its capacity before allowing a new signup, preventing overbooking.</w:t>
+      </w:r>
+    </w:p>
+    <w:p>
+      <w:pPr>
+        <w:pStyle w:val="ListParagraph"/>
+        <w:numPr>
+          <w:ilvl w:val="0"/>
+          <w:numId w:val="1"/>
+        </w:numPr>
+        <w:spacing w:after="80"/>
+      </w:pPr>
+      <w:r>
+        <w:t xml:space="preserve">Built getRegistrationsForEvent (admin-only, protected route) to allow admins to view attendee lists per event.</w:t>
+      </w:r>
+    </w:p>
+    <w:p>
+      <w:pPr>
+        <w:pStyle w:val="ListParagraph"/>
+        <w:numPr>
+          <w:ilvl w:val="0"/>
+          <w:numId w:val="1"/>
+        </w:numPr>
+        <w:spacing w:after="80"/>
+      </w:pPr>
+      <w:r>
+        <w:t xml:space="preserve">Exposed these via POST /api/registrations/:eventId (public) and GET /api/registrations/:eventId (admin-only).</w:t>
+      </w:r>
+    </w:p>
+    <w:p>
+      <w:pPr>
+        <w:spacing w:after="150"/>
+      </w:pPr>
+      <w:r>
+        <w:rPr>
+          <w:b/>
+          <w:bCs/>
+        </w:rPr>
+        <w:t xml:space="preserve">Pages Built:</w:t>
+      </w:r>
+    </w:p>
+    <w:p>
+      <w:pPr>
+        <w:pStyle w:val="ListParagraph"/>
+        <w:numPr>
+          <w:ilvl w:val="0"/>
+          <w:numId w:val="1"/>
+        </w:numPr>
+        <w:spacing w:after="80"/>
+      </w:pPr>
+      <w:r>
+        <w:t xml:space="preserve">Home page — fetches and displays all events from the backend as cards, showing title, date, location, description, and price, each linking to its details page.</w:t>
+      </w:r>
+    </w:p>
+    <w:p>
+      <w:pPr>
+        <w:pStyle w:val="ListParagraph"/>
+        <w:numPr>
+          <w:ilvl w:val="0"/>
+          <w:numId w:val="1"/>
+        </w:numPr>
+        <w:spacing w:after="80"/>
+      </w:pPr>
+      <w:r>
+        <w:t xml:space="preserve">Event Details page — uses dynamic routing (/events/:id) to fetch and display a single event’s full information.</w:t>
+      </w:r>
+    </w:p>
+    <w:p>
+      <w:pPr>
+        <w:pStyle w:val="ListParagraph"/>
+        <w:numPr>
+          <w:ilvl w:val="0"/>
+          <w:numId w:val="1"/>
+        </w:numPr>
+        <w:spacing w:after="80"/>
+      </w:pPr>
+      <w:r>
+        <w:t xml:space="preserve">Public registration form embedded in the Event Details page, allowing any visitor to register with just a name and email, with real-time success/error feedback (e.g., handling a fully-booked event gracefully).</w:t>
+      </w:r>
+    </w:p>
+    <w:p>
+      <w:pPr>
+        <w:spacing w:after="150"/>
+      </w:pPr>
+      <w:r>
+        <w:rPr>
+          <w:b/>
+          <w:bCs/>
+        </w:rPr>
+        <w:t xml:space="preserve">Testing performed:</w:t>
+      </w:r>
+    </w:p>
+    <w:p>
+      <w:pPr>
+        <w:pStyle w:val="ListParagraph"/>
+        <w:numPr>
+          <w:ilvl w:val="0"/>
+          <w:numId w:val="1"/>
+        </w:numPr>
+        <w:spacing w:after="80"/>
+      </w:pPr>
+      <w:r>
+        <w:t xml:space="preserve">Verified the Home page correctly renders live data fetched from MongoDB via the backend API.</w:t>
+      </w:r>
+    </w:p>
+    <w:p>
+      <w:pPr>
+        <w:pStyle w:val="ListParagraph"/>
+        <w:numPr>
+          <w:ilvl w:val="0"/>
+          <w:numId w:val="1"/>
+        </w:numPr>
+        <w:spacing w:after="80"/>
+      </w:pPr>
+      <w:r>
+        <w:t xml:space="preserve">Verified navigation from the Home page to individual Event Details pages using React Router.</w:t>
+      </w:r>
+    </w:p>
+    <w:p>
+      <w:pPr>
+        <w:pStyle w:val="ListParagraph"/>
+        <w:numPr>
+          <w:ilvl w:val="0"/>
+          <w:numId w:val="1"/>
+        </w:numPr>
+        <w:spacing w:after="80"/>
+      </w:pPr>
+      <w:r>
+        <w:t xml:space="preserve">Verified the registration form successfully submits data to the backend and displays a confirmation message on success.</w:t>
+      </w:r>
+    </w:p>
+    <w:p>
+      <w:pPr>
+        <w:spacing w:after="150"/>
+      </w:pPr>
+      <w:r>
+        <w:rPr>
+          <w:i/>
+          <w:iCs/>
+        </w:rPr>
+        <w:t xml:space="preserve">(Sections for the Login/Admin Panel pages, overall testing, and conclusion will be added as development progresses.)</w:t>
       </w:r>
     </w:p>
     <w:p>

</xml_diff>

<commit_message>
Complete project with Phase 3 documentation and conclusion
</commit_message>
<xml_diff>
--- a/docs/project-report.docx
+++ b/docs/project-report.docx
@@ -1632,11 +1632,256 @@
     </w:p>
     <w:p>
       <w:pPr>
+        <w:spacing w:after="150"/>
+      </w:pPr>
+      <w:r>
+        <w:rPr>
+          <w:b/>
+          <w:bCs/>
+        </w:rPr>
+        <w:t xml:space="preserve">Authentication State &amp; Admin Module:</w:t>
+      </w:r>
+    </w:p>
+    <w:p>
+      <w:pPr>
+        <w:pStyle w:val="ListParagraph"/>
+        <w:numPr>
+          <w:ilvl w:val="0"/>
+          <w:numId w:val="1"/>
+        </w:numPr>
+        <w:spacing w:after="80"/>
+      </w:pPr>
+      <w:r>
+        <w:t xml:space="preserve">Implemented a React Context (AuthContext) to manage login state globally across the application, backed by the browser’s localStorage so an admin session persists across page refreshes.</w:t>
+      </w:r>
+    </w:p>
+    <w:p>
+      <w:pPr>
+        <w:pStyle w:val="ListParagraph"/>
+        <w:numPr>
+          <w:ilvl w:val="0"/>
+          <w:numId w:val="1"/>
+        </w:numPr>
+        <w:spacing w:after="80"/>
+      </w:pPr>
+      <w:r>
+        <w:t xml:space="preserve">Configured an Axios request interceptor to automatically attach the logged-in admin’s JWT to every outgoing API request, removing the need to manually add it on each call.</w:t>
+      </w:r>
+    </w:p>
+    <w:p>
+      <w:pPr>
+        <w:pStyle w:val="ListParagraph"/>
+        <w:numPr>
+          <w:ilvl w:val="0"/>
+          <w:numId w:val="1"/>
+        </w:numPr>
+        <w:spacing w:after="80"/>
+      </w:pPr>
+      <w:r>
+        <w:t xml:space="preserve">Built a Login page allowing admin authentication, redirecting to the Admin Panel on success and displaying a clear error message on failure.</w:t>
+      </w:r>
+    </w:p>
+    <w:p>
+      <w:pPr>
+        <w:pStyle w:val="ListParagraph"/>
+        <w:numPr>
+          <w:ilvl w:val="0"/>
+          <w:numId w:val="1"/>
+        </w:numPr>
+        <w:spacing w:after="80"/>
+      </w:pPr>
+      <w:r>
+        <w:t xml:space="preserve">Built a ProtectedRoute component that guards the /admin route, redirecting any non-admin or logged-out visitor to the login page.</w:t>
+      </w:r>
+    </w:p>
+    <w:p>
+      <w:pPr>
+        <w:pStyle w:val="ListParagraph"/>
+        <w:numPr>
+          <w:ilvl w:val="0"/>
+          <w:numId w:val="1"/>
+        </w:numPr>
+        <w:spacing w:after="80"/>
+      </w:pPr>
+      <w:r>
+        <w:t xml:space="preserve">Extended the backend with updateEvent and deleteEvent controller functions and corresponding PUT /api/events/:id and DELETE /api/events/:id routes, both restricted to admins.</w:t>
+      </w:r>
+    </w:p>
+    <w:p>
+      <w:pPr>
+        <w:pStyle w:val="ListParagraph"/>
+        <w:numPr>
+          <w:ilvl w:val="0"/>
+          <w:numId w:val="1"/>
+        </w:numPr>
+        <w:spacing w:after="80"/>
+      </w:pPr>
+      <w:r>
+        <w:t xml:space="preserve">Built the Admin Panel page, providing a single interface for admins to: create new events, edit existing events (via a reusable form that switches between create/edit modes), delete events with a confirmation prompt, and view the list of registrants for any specific event.</w:t>
+      </w:r>
+    </w:p>
+    <w:p>
+      <w:pPr>
+        <w:spacing w:after="150"/>
+      </w:pPr>
+      <w:r>
+        <w:rPr>
+          <w:b/>
+          <w:bCs/>
+        </w:rPr>
+        <w:t xml:space="preserve">Final Testing performed (Phase 3):</w:t>
+      </w:r>
+    </w:p>
+    <w:p>
+      <w:pPr>
+        <w:pStyle w:val="ListParagraph"/>
+        <w:numPr>
+          <w:ilvl w:val="0"/>
+          <w:numId w:val="1"/>
+        </w:numPr>
+        <w:spacing w:after="80"/>
+      </w:pPr>
+      <w:r>
+        <w:t xml:space="preserve">Verified admin login succeeds with correct credentials and fails with a clear error on incorrect credentials.</w:t>
+      </w:r>
+    </w:p>
+    <w:p>
+      <w:pPr>
+        <w:pStyle w:val="ListParagraph"/>
+        <w:numPr>
+          <w:ilvl w:val="0"/>
+          <w:numId w:val="1"/>
+        </w:numPr>
+        <w:spacing w:after="80"/>
+      </w:pPr>
+      <w:r>
+        <w:t xml:space="preserve">Verified successful login redirects to the Admin Panel, and the session persists correctly.</w:t>
+      </w:r>
+    </w:p>
+    <w:p>
+      <w:pPr>
+        <w:pStyle w:val="ListParagraph"/>
+        <w:numPr>
+          <w:ilvl w:val="0"/>
+          <w:numId w:val="1"/>
+        </w:numPr>
+        <w:spacing w:after="80"/>
+      </w:pPr>
+      <w:r>
+        <w:t xml:space="preserve">Verified event creation, editing, and deletion all correctly reflect in both the admin view and the public homepage.</w:t>
+      </w:r>
+    </w:p>
+    <w:p>
+      <w:pPr>
+        <w:pStyle w:val="ListParagraph"/>
+        <w:numPr>
+          <w:ilvl w:val="0"/>
+          <w:numId w:val="1"/>
+        </w:numPr>
+        <w:spacing w:after="80"/>
+      </w:pPr>
+      <w:r>
+        <w:t xml:space="preserve">Verified the "View Registrations" feature correctly displays attendee names and emails for a given event.</w:t>
+      </w:r>
+    </w:p>
+    <w:p>
+      <w:pPr>
+        <w:pStyle w:val="ListParagraph"/>
+        <w:numPr>
+          <w:ilvl w:val="0"/>
+          <w:numId w:val="1"/>
+        </w:numPr>
+        <w:spacing w:after="80"/>
+      </w:pPr>
+      <w:r>
+        <w:t xml:space="preserve">Verified route protection: accessing /admin while logged out (or after logging out) correctly redirects to the login page rather than exposing admin functionality.</w:t>
+      </w:r>
+    </w:p>
+    <w:p>
+      <w:pPr>
         <w:pStyle w:val="Heading1"/>
         <w:spacing w:after="150" w:before="300"/>
       </w:pPr>
       <w:r>
-        <w:t xml:space="preserve">8. References</w:t>
+        <w:t xml:space="preserve">8. Conclusion</w:t>
+      </w:r>
+    </w:p>
+    <w:p>
+      <w:pPr>
+        <w:spacing w:after="150"/>
+      </w:pPr>
+      <w:r>
+        <w:t xml:space="preserve">This project successfully delivers a functional full-stack Event Management Website that fulfills all objectives outlined in the initial scope. The public-facing site allows visitors to browse events, view detailed information, and register without needing an account. The admin panel provides complete control over event data, including creation, editing, deletion, and attendee tracking, with all administrative actions properly secured behind authentication and role-based authorization. The system was built and verified incrementally at each stage, using Thunder Client for backend API testing and manual browser testing for frontend functionality, ensuring each layer worked correctly before building on top of it.</w:t>
+      </w:r>
+    </w:p>
+    <w:p>
+      <w:pPr>
+        <w:pStyle w:val="Heading2"/>
+        <w:spacing w:after="120" w:before="250"/>
+      </w:pPr>
+      <w:r>
+        <w:t xml:space="preserve">Future Enhancements</w:t>
+      </w:r>
+    </w:p>
+    <w:p>
+      <w:pPr>
+        <w:pStyle w:val="ListParagraph"/>
+        <w:numPr>
+          <w:ilvl w:val="0"/>
+          <w:numId w:val="1"/>
+        </w:numPr>
+        <w:spacing w:after="80"/>
+      </w:pPr>
+      <w:r>
+        <w:t xml:space="preserve">Email notifications/confirmations upon successful registration.</w:t>
+      </w:r>
+    </w:p>
+    <w:p>
+      <w:pPr>
+        <w:pStyle w:val="ListParagraph"/>
+        <w:numPr>
+          <w:ilvl w:val="0"/>
+          <w:numId w:val="1"/>
+        </w:numPr>
+        <w:spacing w:after="80"/>
+      </w:pPr>
+      <w:r>
+        <w:t xml:space="preserve">Online payment integration for paid events.</w:t>
+      </w:r>
+    </w:p>
+    <w:p>
+      <w:pPr>
+        <w:pStyle w:val="ListParagraph"/>
+        <w:numPr>
+          <w:ilvl w:val="0"/>
+          <w:numId w:val="1"/>
+        </w:numPr>
+        <w:spacing w:after="80"/>
+      </w:pPr>
+      <w:r>
+        <w:t xml:space="preserve">Search and filtering of events by date, location, or category.</w:t>
+      </w:r>
+    </w:p>
+    <w:p>
+      <w:pPr>
+        <w:pStyle w:val="ListParagraph"/>
+        <w:numPr>
+          <w:ilvl w:val="0"/>
+          <w:numId w:val="1"/>
+        </w:numPr>
+        <w:spacing w:after="80"/>
+      </w:pPr>
+      <w:r>
+        <w:t xml:space="preserve">Pagination for large numbers of events.</w:t>
+      </w:r>
+    </w:p>
+    <w:p>
+      <w:pPr>
+        <w:pStyle w:val="Heading1"/>
+        <w:spacing w:after="150" w:before="300"/>
+      </w:pPr>
+      <w:r>
+        <w:t xml:space="preserve">9. References</w:t>
       </w:r>
     </w:p>
     <w:p>

</xml_diff>